<commit_message>
docs: finalize zte defense and acceptance materials
</commit_message>
<xml_diff>
--- a/competition/zte/final-package/BugMentor-中兴赛道-技术文档.docx
+++ b/competition/zte/final-package/BugMentor-中兴赛道-技术文档.docx
@@ -2485,7 +2485,7 @@
         </w:rPr>
         <w:t xml:space="preserve">前端：</w:t>
       </w:r>
-      <w:hyperlink w:history="1" r:id="rIdlqgi0t17-gzjsqbpqi70l">
+      <w:hyperlink w:history="1" r:id="rId8o70s-z-9od2z5veethik">
         <w:r>
           <w:rPr>
             <w:rFonts w:ascii="Microsoft YaHei" w:cs="Microsoft YaHei" w:eastAsia="Microsoft YaHei" w:hAnsi="Microsoft YaHei"/>
@@ -2511,7 +2511,7 @@
         </w:rPr>
         <w:t xml:space="preserve">后端：</w:t>
       </w:r>
-      <w:hyperlink w:history="1" r:id="rIda7_ifdmsawqfbaedkcp1l">
+      <w:hyperlink w:history="1" r:id="rId9_qfzecqzpm9buoxjas5g">
         <w:r>
           <w:rPr>
             <w:rFonts w:ascii="Microsoft YaHei" w:cs="Microsoft YaHei" w:eastAsia="Microsoft YaHei" w:hAnsi="Microsoft YaHei"/>
@@ -2537,7 +2537,7 @@
         </w:rPr>
         <w:t xml:space="preserve">API 文档：</w:t>
       </w:r>
-      <w:hyperlink w:history="1" r:id="rId9m3mdq9uym_guhandvoil">
+      <w:hyperlink w:history="1" r:id="rIdhnns6neyasg6qz34xa0ic">
         <w:r>
           <w:rPr>
             <w:rFonts w:ascii="Microsoft YaHei" w:cs="Microsoft YaHei" w:eastAsia="Microsoft YaHei" w:hAnsi="Microsoft YaHei"/>

</xml_diff>